<commit_message>
Edits to Phase of the plan
</commit_message>
<xml_diff>
--- a/00 Project Plan/00 SpyKids_Project_Plan.docx
+++ b/00 Project Plan/00 SpyKids_Project_Plan.docx
@@ -924,7 +924,7 @@
                 <w:b w:val="false"/>
                 <w:bCs w:val="false"/>
               </w:rPr>
-              <w:t xml:space="preserve">Run the selected methods (informal interviews, review of existing forums/support communities, secondary data) — probe both segments (with/without financial difficulty) where possible</w:t>
+              <w:t xml:space="preserve">Pilot the selected methods with 1–2 participants (a small first pass, not the full data collection) — e.g. one informal interview, one quick look at an online forum</w:t>
             </w:r>
           </w:p>
         </w:tc>
@@ -938,7 +938,7 @@
                 <w:b w:val="false"/>
                 <w:bCs w:val="false"/>
               </w:rPr>
-              <w:t xml:space="preserve">Raw research notes/data</w:t>
+              <w:t xml:space="preserve">Pilot notes</w:t>
             </w:r>
           </w:p>
         </w:tc>
@@ -952,7 +952,7 @@
                 <w:b w:val="false"/>
                 <w:bCs w:val="false"/>
               </w:rPr>
-              <w:t xml:space="preserve">Whole team, by method</w:t>
+              <w:t xml:space="preserve">1–2 members</w:t>
             </w:r>
           </w:p>
         </w:tc>
@@ -982,7 +982,7 @@
                 <w:b w:val="false"/>
                 <w:bCs w:val="false"/>
               </w:rPr>
-              <w:t xml:space="preserve">Ethics &amp; values pass (Week 4 topic: vulnerable population) — revisit before and after data collection</w:t>
+              <w:t xml:space="preserve">Ethics &amp; values pass (Week 4 topic: vulnerable population) — revisit before and after the pilot</w:t>
             </w:r>
           </w:p>
         </w:tc>
@@ -1040,7 +1040,7 @@
                 <w:b w:val="false"/>
                 <w:bCs w:val="false"/>
               </w:rPr>
-              <w:t xml:space="preserve">Synthesis session: cross-check findings against the Week 3 assumptions, including the financial-difficulty segmentation and the six sub-problems above</w:t>
+              <w:t xml:space="preserve">Synthesis session: cross-check the pilot and literature findings against the Week 3 assumptions</w:t>
             </w:r>
           </w:p>
         </w:tc>
@@ -1109,7 +1109,7 @@
         <w:spacing w:after="150" w:before="300"/>
       </w:pPr>
       <w:r>
-        <w:t xml:space="preserve">Phase 2 — Individual Proposal Writing</w:t>
+        <w:t xml:space="preserve">Phase 2 — Knowledge Gathering</w:t>
       </w:r>
     </w:p>
     <w:p>
@@ -1121,59 +1121,15 @@
           <w:b/>
           <w:bCs/>
         </w:rPr>
-        <w:t xml:space="preserve">Weeks 5–7 (27/08, 03/09, 10/09/26), due 07/09/26 3pm — Assessment 1 (20%/10%)</w:t>
-      </w:r>
-    </w:p>
-    <w:p>
-      <w:pPr>
-        <w:pStyle w:val="ListParagraph"/>
-        <w:numPr>
-          <w:ilvl w:val="0"/>
-          <w:numId w:val="1"/>
-        </w:numPr>
-        <w:spacing w:after="60"/>
-      </w:pPr>
-      <w:r>
-        <w:t xml:space="preserve">~1500 words, individual: your own vision for the project</w:t>
-      </w:r>
-    </w:p>
-    <w:p>
-      <w:pPr>
-        <w:pStyle w:val="ListParagraph"/>
-        <w:numPr>
-          <w:ilvl w:val="0"/>
-          <w:numId w:val="1"/>
-        </w:numPr>
-        <w:spacing w:after="60"/>
-      </w:pPr>
-      <w:r>
-        <w:t xml:space="preserve">Structure: (1) main idea, (2) desired interactions supported by the application, (3) potential ethical issues</w:t>
-      </w:r>
-    </w:p>
-    <w:p>
-      <w:pPr>
-        <w:pStyle w:val="ListParagraph"/>
-        <w:numPr>
-          <w:ilvl w:val="0"/>
-          <w:numId w:val="1"/>
-        </w:numPr>
-        <w:spacing w:after="60"/>
-      </w:pPr>
-      <w:r>
-        <w:t xml:space="preserve">Note: this is where "desired interactions" first appears in the brief — the syllabus positions this as the first legitimate point to start sketching what kind of interaction might help, still grounded in the problem analysis from Phase 1</w:t>
-      </w:r>
-    </w:p>
-    <w:p>
-      <w:pPr>
-        <w:pStyle w:val="ListParagraph"/>
-        <w:numPr>
-          <w:ilvl w:val="0"/>
-          <w:numId w:val="1"/>
-        </w:numPr>
-        <w:spacing w:after="60"/>
-      </w:pPr>
-      <w:r>
-        <w:t xml:space="preserve">APA referencing; AI use must be acknowledged with a shareable chat link</w:t>
+        <w:t xml:space="preserve">Weeks 4–5 (20/08, 27/08/26)</w:t>
+      </w:r>
+    </w:p>
+    <w:p>
+      <w:pPr>
+        <w:spacing w:after="120"/>
+      </w:pPr>
+      <w:r>
+        <w:t xml:space="preserve">Deepens and completes the research set in motion in Phase 1: executing the full Suite of Methods the team agreed on in Week 3, before any synthesis or design thinking begins. This phase is about building the team's shared evidence base — not about writing anything for submission.</w:t>
       </w:r>
     </w:p>
     <w:p>
@@ -1183,7 +1139,7 @@
     </w:p>
     <w:tbl>
       <w:tblPr>
-        <w:tblW w:type="dxa" w:w="8600"/>
+        <w:tblW w:type="dxa" w:w="9000"/>
         <w:tblBorders>
           <w:top w:val="single" w:color="auto" w:sz="4"/>
           <w:left w:val="single" w:color="auto" w:sz="4"/>
@@ -1195,8 +1151,9 @@
       </w:tblPr>
       <w:tblGrid>
         <w:gridCol w:w="3400"/>
-        <w:gridCol w:w="3200"/>
+        <w:gridCol w:w="2400"/>
         <w:gridCol w:w="2000"/>
+        <w:gridCol w:w="1200"/>
       </w:tblGrid>
       <w:tr>
         <w:trPr>
@@ -1220,7 +1177,7 @@
         </w:tc>
         <w:tc>
           <w:tcPr>
-            <w:tcW w:type="dxa" w:w="3200"/>
+            <w:tcW w:type="dxa" w:w="2400"/>
             <w:shd w:fill="1F4E5F" w:val="clear"/>
           </w:tcPr>
           <w:p>
@@ -1230,7 +1187,7 @@
                 <w:bCs/>
                 <w:color w:val="FFFFFF"/>
               </w:rPr>
-              <w:t xml:space="preserve">Studio Topic</w:t>
+              <w:t xml:space="preserve">Output</w:t>
             </w:r>
           </w:p>
         </w:tc>
@@ -1246,6 +1203,22 @@
                 <w:bCs/>
                 <w:color w:val="FFFFFF"/>
               </w:rPr>
+              <w:t xml:space="preserve">Owner</w:t>
+            </w:r>
+          </w:p>
+        </w:tc>
+        <w:tc>
+          <w:tcPr>
+            <w:tcW w:type="dxa" w:w="1200"/>
+            <w:shd w:fill="1F4E5F" w:val="clear"/>
+          </w:tcPr>
+          <w:p>
+            <w:r>
+              <w:rPr>
+                <w:b/>
+                <w:bCs/>
+                <w:color w:val="FFFFFF"/>
+              </w:rPr>
               <w:t xml:space="preserve">Target</w:t>
             </w:r>
           </w:p>
@@ -1262,21 +1235,21 @@
                 <w:b w:val="false"/>
                 <w:bCs w:val="false"/>
               </w:rPr>
-              <w:t xml:space="preserve">Qualitative data analysis of any research gathered</w:t>
-            </w:r>
-          </w:p>
-        </w:tc>
-        <w:tc>
-          <w:tcPr>
-            <w:tcW w:type="dxa" w:w="3200"/>
-          </w:tcPr>
-          <w:p>
-            <w:r>
-              <w:rPr>
-                <w:b w:val="false"/>
-                <w:bCs w:val="false"/>
-              </w:rPr>
-              <w:t xml:space="preserve">Week 5 — Data Analysis</w:t>
+              <w:t xml:space="preserve">Complete literature review — extend the Phase 1 scan into a fuller annotated bibliography</w:t>
+            </w:r>
+          </w:p>
+        </w:tc>
+        <w:tc>
+          <w:tcPr>
+            <w:tcW w:type="dxa" w:w="2400"/>
+          </w:tcPr>
+          <w:p>
+            <w:r>
+              <w:rPr>
+                <w:b w:val="false"/>
+                <w:bCs w:val="false"/>
+              </w:rPr>
+              <w:t xml:space="preserve">Annotated bibliography (8–10+ sources)</w:t>
             </w:r>
           </w:p>
         </w:tc>
@@ -1290,7 +1263,21 @@
                 <w:b w:val="false"/>
                 <w:bCs w:val="false"/>
               </w:rPr>
-              <w:t xml:space="preserve">27/08/26</w:t>
+              <w:t xml:space="preserve">2 members (rotating/expanding)</w:t>
+            </w:r>
+          </w:p>
+        </w:tc>
+        <w:tc>
+          <w:tcPr>
+            <w:tcW w:type="dxa" w:w="1200"/>
+          </w:tcPr>
+          <w:p>
+            <w:r>
+              <w:rPr>
+                <w:b w:val="false"/>
+                <w:bCs w:val="false"/>
+              </w:rPr>
+              <w:t xml:space="preserve">Week 4</w:t>
             </w:r>
           </w:p>
         </w:tc>
@@ -1306,21 +1293,21 @@
                 <w:b w:val="false"/>
                 <w:bCs w:val="false"/>
               </w:rPr>
-              <w:t xml:space="preserve">Individual draft of proposal</w:t>
-            </w:r>
-          </w:p>
-        </w:tc>
-        <w:tc>
-          <w:tcPr>
-            <w:tcW w:type="dxa" w:w="3200"/>
-          </w:tcPr>
-          <w:p>
-            <w:r>
-              <w:rPr>
-                <w:b w:val="false"/>
-                <w:bCs w:val="false"/>
-              </w:rPr>
-              <w:t xml:space="preserve">Week 6 — Prototyping &amp; Interactions</w:t>
+              <w:t xml:space="preserve">Formulate question guides for each assigned method (Contextual Inquiry, Rapid Ethnography, Digital Ethnography, Mapping, Object Inventory), informed by what the Week 4 pilot surfaced</w:t>
+            </w:r>
+          </w:p>
+        </w:tc>
+        <w:tc>
+          <w:tcPr>
+            <w:tcW w:type="dxa" w:w="2400"/>
+          </w:tcPr>
+          <w:p>
+            <w:r>
+              <w:rPr>
+                <w:b w:val="false"/>
+                <w:bCs w:val="false"/>
+              </w:rPr>
+              <w:t xml:space="preserve">Method-specific question/prompt guides</w:t>
             </w:r>
           </w:p>
         </w:tc>
@@ -1334,7 +1321,21 @@
                 <w:b w:val="false"/>
                 <w:bCs w:val="false"/>
               </w:rPr>
-              <w:t xml:space="preserve">03/09/26</w:t>
+              <w:t xml:space="preserve">Each member, for their assigned method</w:t>
+            </w:r>
+          </w:p>
+        </w:tc>
+        <w:tc>
+          <w:tcPr>
+            <w:tcW w:type="dxa" w:w="1200"/>
+          </w:tcPr>
+          <w:p>
+            <w:r>
+              <w:rPr>
+                <w:b w:val="false"/>
+                <w:bCs w:val="false"/>
+              </w:rPr>
+              <w:t xml:space="preserve">Week 4</w:t>
             </w:r>
           </w:p>
         </w:tc>
@@ -1350,21 +1351,21 @@
                 <w:b w:val="false"/>
                 <w:bCs w:val="false"/>
               </w:rPr>
-              <w:t xml:space="preserve">Peer feedback within team</w:t>
-            </w:r>
-          </w:p>
-        </w:tc>
-        <w:tc>
-          <w:tcPr>
-            <w:tcW w:type="dxa" w:w="3200"/>
-          </w:tcPr>
-          <w:p>
-            <w:r>
-              <w:rPr>
-                <w:b w:val="false"/>
-                <w:bCs w:val="false"/>
-              </w:rPr>
-              <w:t xml:space="preserve">—</w:t>
+              <w:t xml:space="preserve">Conduct the full round of interviews / observations / mapping sessions / object inventories (beyond the Week 4 pilot) — each member engages at least one participant; team-wide target 6–10 participants</w:t>
+            </w:r>
+          </w:p>
+        </w:tc>
+        <w:tc>
+          <w:tcPr>
+            <w:tcW w:type="dxa" w:w="2400"/>
+          </w:tcPr>
+          <w:p>
+            <w:r>
+              <w:rPr>
+                <w:b w:val="false"/>
+                <w:bCs w:val="false"/>
+              </w:rPr>
+              <w:t xml:space="preserve">Transcripts, observation logs, maps, object inventories</w:t>
             </w:r>
           </w:p>
         </w:tc>
@@ -1378,7 +1379,21 @@
                 <w:b w:val="false"/>
                 <w:bCs w:val="false"/>
               </w:rPr>
-              <w:t xml:space="preserve">by 05/09/26</w:t>
+              <w:t xml:space="preserve">Each member</w:t>
+            </w:r>
+          </w:p>
+        </w:tc>
+        <w:tc>
+          <w:tcPr>
+            <w:tcW w:type="dxa" w:w="1200"/>
+          </w:tcPr>
+          <w:p>
+            <w:r>
+              <w:rPr>
+                <w:b w:val="false"/>
+                <w:bCs w:val="false"/>
+              </w:rPr>
+              <w:t xml:space="preserve">Week 4–5</w:t>
             </w:r>
           </w:p>
         </w:tc>
@@ -1394,21 +1409,21 @@
                 <w:b w:val="false"/>
                 <w:bCs w:val="false"/>
               </w:rPr>
-              <w:t xml:space="preserve">Submit Assessment 1</w:t>
-            </w:r>
-          </w:p>
-        </w:tc>
-        <w:tc>
-          <w:tcPr>
-            <w:tcW w:type="dxa" w:w="3200"/>
-          </w:tcPr>
-          <w:p>
-            <w:r>
-              <w:rPr>
-                <w:b w:val="false"/>
-                <w:bCs w:val="false"/>
-              </w:rPr>
-              <w:t xml:space="preserve">—</w:t>
+              <w:t xml:space="preserve">Digital ethnography: notify gatekeeper/community first, then observe/participate per ethical conduct expectations</w:t>
+            </w:r>
+          </w:p>
+        </w:tc>
+        <w:tc>
+          <w:tcPr>
+            <w:tcW w:type="dxa" w:w="2400"/>
+          </w:tcPr>
+          <w:p>
+            <w:r>
+              <w:rPr>
+                <w:b w:val="false"/>
+                <w:bCs w:val="false"/>
+              </w:rPr>
+              <w:t xml:space="preserve">Digital ethnography log</w:t>
             </w:r>
           </w:p>
         </w:tc>
@@ -1422,7 +1437,21 @@
                 <w:b w:val="false"/>
                 <w:bCs w:val="false"/>
               </w:rPr>
-              <w:t xml:space="preserve">07/09/26, 3pm</w:t>
+              <w:t xml:space="preserve">Assigned member(s)</w:t>
+            </w:r>
+          </w:p>
+        </w:tc>
+        <w:tc>
+          <w:tcPr>
+            <w:tcW w:type="dxa" w:w="1200"/>
+          </w:tcPr>
+          <w:p>
+            <w:r>
+              <w:rPr>
+                <w:b w:val="false"/>
+                <w:bCs w:val="false"/>
+              </w:rPr>
+              <w:t xml:space="preserve">Week 4–5</w:t>
             </w:r>
           </w:p>
         </w:tc>
@@ -1438,21 +1467,21 @@
                 <w:b w:val="false"/>
                 <w:bCs w:val="false"/>
               </w:rPr>
-              <w:t xml:space="preserve">(Studio session continues)</w:t>
-            </w:r>
-          </w:p>
-        </w:tc>
-        <w:tc>
-          <w:tcPr>
-            <w:tcW w:type="dxa" w:w="3200"/>
-          </w:tcPr>
-          <w:p>
-            <w:r>
-              <w:rPr>
-                <w:b w:val="false"/>
-                <w:bCs w:val="false"/>
-              </w:rPr>
-              <w:t xml:space="preserve">Week 7 — UX</w:t>
+              <w:t xml:space="preserve">Qualitative data analysis (Week 5 studio topic) — code all data against Who/How/Why/Impact/Risks, the financial-difficulty segmentation, and an "unexpected" category</w:t>
+            </w:r>
+          </w:p>
+        </w:tc>
+        <w:tc>
+          <w:tcPr>
+            <w:tcW w:type="dxa" w:w="2400"/>
+          </w:tcPr>
+          <w:p>
+            <w:r>
+              <w:rPr>
+                <w:b w:val="false"/>
+                <w:bCs w:val="false"/>
+              </w:rPr>
+              <w:t xml:space="preserve">Coded findings</w:t>
             </w:r>
           </w:p>
         </w:tc>
@@ -1466,7 +1495,137 @@
                 <w:b w:val="false"/>
                 <w:bCs w:val="false"/>
               </w:rPr>
-              <w:t xml:space="preserve">10/09/26</w:t>
+              <w:t xml:space="preserve">Whole team</w:t>
+            </w:r>
+          </w:p>
+        </w:tc>
+        <w:tc>
+          <w:tcPr>
+            <w:tcW w:type="dxa" w:w="1200"/>
+          </w:tcPr>
+          <w:p>
+            <w:r>
+              <w:rPr>
+                <w:b w:val="false"/>
+                <w:bCs w:val="false"/>
+              </w:rPr>
+              <w:t xml:space="preserve">Week 5</w:t>
+            </w:r>
+          </w:p>
+        </w:tc>
+      </w:tr>
+      <w:tr>
+        <w:tc>
+          <w:tcPr>
+            <w:tcW w:type="dxa" w:w="3400"/>
+          </w:tcPr>
+          <w:p>
+            <w:r>
+              <w:rPr>
+                <w:b w:val="false"/>
+                <w:bCs w:val="false"/>
+              </w:rPr>
+              <w:t xml:space="preserve">Team synthesis session — test the "financial difficulty is the key segmenting variable" assumption against what the data shows</w:t>
+            </w:r>
+          </w:p>
+        </w:tc>
+        <w:tc>
+          <w:tcPr>
+            <w:tcW w:type="dxa" w:w="2400"/>
+          </w:tcPr>
+          <w:p>
+            <w:r>
+              <w:rPr>
+                <w:b w:val="false"/>
+                <w:bCs w:val="false"/>
+              </w:rPr>
+              <w:t xml:space="preserve">Synthesised findings + updated framing</w:t>
+            </w:r>
+          </w:p>
+        </w:tc>
+        <w:tc>
+          <w:tcPr>
+            <w:tcW w:type="dxa" w:w="2000"/>
+          </w:tcPr>
+          <w:p>
+            <w:r>
+              <w:rPr>
+                <w:b w:val="false"/>
+                <w:bCs w:val="false"/>
+              </w:rPr>
+              <w:t xml:space="preserve">Whole team</w:t>
+            </w:r>
+          </w:p>
+        </w:tc>
+        <w:tc>
+          <w:tcPr>
+            <w:tcW w:type="dxa" w:w="1200"/>
+          </w:tcPr>
+          <w:p>
+            <w:r>
+              <w:rPr>
+                <w:b w:val="false"/>
+                <w:bCs w:val="false"/>
+              </w:rPr>
+              <w:t xml:space="preserve">Week 5</w:t>
+            </w:r>
+          </w:p>
+        </w:tc>
+      </w:tr>
+      <w:tr>
+        <w:tc>
+          <w:tcPr>
+            <w:tcW w:type="dxa" w:w="3400"/>
+          </w:tcPr>
+          <w:p>
+            <w:r>
+              <w:rPr>
+                <w:b w:val="false"/>
+                <w:bCs w:val="false"/>
+              </w:rPr>
+              <w:t xml:space="preserve">Design concept hypothesis — the formal Week 3–5 output Assessment 2 grades; a shared direction, not a specification</w:t>
+            </w:r>
+          </w:p>
+        </w:tc>
+        <w:tc>
+          <w:tcPr>
+            <w:tcW w:type="dxa" w:w="2400"/>
+          </w:tcPr>
+          <w:p>
+            <w:r>
+              <w:rPr>
+                <w:b w:val="false"/>
+                <w:bCs w:val="false"/>
+              </w:rPr>
+              <w:t xml:space="preserve">Design concept hypothesis</w:t>
+            </w:r>
+          </w:p>
+        </w:tc>
+        <w:tc>
+          <w:tcPr>
+            <w:tcW w:type="dxa" w:w="2000"/>
+          </w:tcPr>
+          <w:p>
+            <w:r>
+              <w:rPr>
+                <w:b w:val="false"/>
+                <w:bCs w:val="false"/>
+              </w:rPr>
+              <w:t xml:space="preserve">Whole team</w:t>
+            </w:r>
+          </w:p>
+        </w:tc>
+        <w:tc>
+          <w:tcPr>
+            <w:tcW w:type="dxa" w:w="1200"/>
+          </w:tcPr>
+          <w:p>
+            <w:r>
+              <w:rPr>
+                <w:b w:val="false"/>
+                <w:bCs w:val="false"/>
+              </w:rPr>
+              <w:t xml:space="preserve">Week 5</w:t>
             </w:r>
           </w:p>
         </w:tc>
@@ -1481,10 +1640,10 @@
           <w:b/>
           <w:bCs/>
         </w:rPr>
-        <w:t xml:space="preserve">Note on overlap: </w:t>
-      </w:r>
-      <w:r>
-        <w:t xml:space="preserve">Assessment 1 is due 07/09/26, a few days before the Week 7 studio session (10/09/26) and while Phase 3 team prototyping is already underway. This is intentional — individual proposal writing (Phase 2) and early team-level prototyping (Phase 3) run concurrently across Weeks 6–7, not sequentially. Budget team time accordingly.</w:t>
+        <w:t xml:space="preserve">Not a phase — Assessment 1 (Individual Proposal): </w:t>
+      </w:r>
+      <w:r>
+        <w:t xml:space="preserve">Assessment 1 (~1500 words, due 07/09/26, 3pm) isn't a separate stage of the project. It's an individual deliverable each member writes by drawing on the shared knowledge base built across Phases 1–2 — their own take on the problem, desired interactions, and ethical issues. It happens in parallel with Phase 3's early team prototyping, not before or after it as its own gate.</w:t>
       </w:r>
     </w:p>
     <w:p>
@@ -1557,7 +1716,7 @@
         <w:spacing w:after="60"/>
       </w:pPr>
       <w:r>
-        <w:t xml:space="preserve">Runs concurrently with Phase 2 — the individual Assessment 1 due 07/09/26 sits inside this window</w:t>
+        <w:t xml:space="preserve">Draws on Phase 2's synthesised findings and design concept hypothesis, plus each member's individual Assessment 1 proposal (due 07/09/26) as they come in — Assessment 1 sits inside this window, not before it</w:t>
       </w:r>
     </w:p>
     <w:p>
@@ -1668,7 +1827,7 @@
                 <w:b w:val="false"/>
                 <w:bCs w:val="false"/>
               </w:rPr>
-              <w:t xml:space="preserve">Reconcile the individual Assessment 1 proposals into one team direction; note what's being dropped and why</w:t>
+              <w:t xml:space="preserve">Reconcile individual Assessment 1 proposals with the Phase 2 design concept hypothesis into one team direction; note what's being dropped and why</w:t>
             </w:r>
           </w:p>
         </w:tc>
@@ -1712,7 +1871,7 @@
                 <w:b w:val="false"/>
                 <w:bCs w:val="false"/>
               </w:rPr>
-              <w:t xml:space="preserve">Produce 2–3 rough concept sketches/paper prototypes, critique as a team against the Phase 1 research findings, pick one</w:t>
+              <w:t xml:space="preserve">Produce 2–3 rough concept sketches/paper prototypes, critique as a team against the Phase 1–2 research findings, pick one</w:t>
             </w:r>
           </w:p>
         </w:tc>

</xml_diff>

<commit_message>
Documentation of Problem Identification
</commit_message>
<xml_diff>
--- a/00 Project Plan/00 SpyKids_Project_Plan.docx
+++ b/00 Project Plan/00 SpyKids_Project_Plan.docx
@@ -1100,7 +1100,7 @@
         <w:t xml:space="preserve">Gate before moving to Phase 2: </w:t>
       </w:r>
       <w:r>
-        <w:t xml:space="preserve">the team (and each member individually, since Assessment 1 is individual) should be able to state the problem, its stakeholders, and its ethical risks clearly, backed by at least two independent sources of evidence — without naming a solution. If Cycle 1b synthesis surfaces a significantly different picture than Cycle 1a assumed — including whether the financial-difficulty split actually holds up — revise the framing before moving on.</w:t>
+        <w:t xml:space="preserve">the team (and each member individually, since Assessment 1 is individual) should be able to state the problem, its stakeholders, and its ethical risks clearly, backed by at least two independent sources of evidence — without naming a solution. This is now formalised as a Problem Identification Document — a single reviewable file consolidating the Who/How/Why/Impact/Risks framing, the Week 3 financial-difficulty segmentation, and a living Assumptions Register marking every claim as untested/tested/confirmed. Phase 2 doesn't start in earnest until this document exists in reviewable form. If Cycle 1b synthesis surfaces a significantly different picture than Cycle 1a assumed, revise the framing before moving on.</w:t>
       </w:r>
     </w:p>
     <w:p>
@@ -1129,7 +1129,7 @@
         <w:spacing w:after="120"/>
       </w:pPr>
       <w:r>
-        <w:t xml:space="preserve">Deepens and completes the research set in motion in Phase 1: executing the full Suite of Methods the team agreed on in Week 3, before any synthesis or design thinking begins. This phase is about building the team's shared evidence base — not about writing anything for submission.</w:t>
+        <w:t xml:space="preserve">Deepens and completes the research set in motion in Phase 1: executing the full Suite of Methods the team agreed on in Week 3, before any synthesis or design thinking begins. This phase is about building the team's shared evidence base — not about writing anything for submission. Phase 2 starts from the Problem Identification Document produced at the end of Phase 1, and its central job is to work through that document's Assumptions Register, testing each row against real evidence.</w:t>
       </w:r>
     </w:p>
     <w:p>

</xml_diff>